<commit_message>
docs: adopt ysna integration workflow
</commit_message>
<xml_diff>
--- a/docs/Daon 사용자형 지식 업무지원 프로그램 상세 설계서.docx
+++ b/docs/Daon 사용자형 지식 업무지원 프로그램 상세 설계서.docx
@@ -52,21 +52,7 @@
         <w:jc w:val="center"/>
       </w:pPr>
       <w:r>
-        <w:rPr>
-          <w:rFonts w:ascii="Malgun Gothic" w:hAnsi="Malgun Gothic" w:eastAsia="Malgun Gothic" w:cs="Malgun Gothic"/>
-          <w:b/>
-          <w:color w:val="5B6573"/>
-          <w:sz w:val="20"/>
-        </w:rPr>
-        <w:t xml:space="preserve">문서 구분  </w:t>
-      </w:r>
-      <w:r>
-        <w:rPr>
-          <w:rFonts w:ascii="Malgun Gothic" w:hAnsi="Malgun Gothic" w:eastAsia="Malgun Gothic" w:cs="Malgun Gothic"/>
-          <w:color w:val="5B6573"/>
-          <w:sz w:val="20"/>
-        </w:rPr>
-        <w:t>독립 제품 상세 설계 정본</w:t>
+        <w:t>문서 구분  독립 제품 상세 설계 정본 · 버전 0.7</w:t>
       </w:r>
     </w:p>
     <w:p>
@@ -75,21 +61,7 @@
         <w:jc w:val="center"/>
       </w:pPr>
       <w:r>
-        <w:rPr>
-          <w:rFonts w:ascii="Malgun Gothic" w:hAnsi="Malgun Gothic" w:eastAsia="Malgun Gothic" w:cs="Malgun Gothic"/>
-          <w:b/>
-          <w:color w:val="5B6573"/>
-          <w:sz w:val="20"/>
-        </w:rPr>
-        <w:t xml:space="preserve">작성일  </w:t>
-      </w:r>
-      <w:r>
-        <w:rPr>
-          <w:rFonts w:ascii="Malgun Gothic" w:hAnsi="Malgun Gothic" w:eastAsia="Malgun Gothic" w:cs="Malgun Gothic"/>
-          <w:color w:val="5B6573"/>
-          <w:sz w:val="20"/>
-        </w:rPr>
-        <w:t>2026-07-20</w:t>
+        <w:t>작성일  2026-07-20 · 개정  ysna-server 격리 개발·통합 배포 기준 반영</w:t>
       </w:r>
     </w:p>
     <w:p>
@@ -20486,12 +20458,7 @@
         <w:spacing w:before="0" w:after="80" w:line="300" w:lineRule="auto"/>
       </w:pPr>
       <w:r>
-        <w:rPr>
-          <w:rFonts w:ascii="Malgun Gothic" w:hAnsi="Malgun Gothic" w:eastAsia="Malgun Gothic" w:cs="Malgun Gothic"/>
-          <w:color w:val="20242A"/>
-          <w:sz w:val="22"/>
-        </w:rPr>
-        <w:t>로컬 개발 단계: 개발 PC에서 Product Process를 실행하고 DB는 WSL에 구성한다. 전체 화면·운영 흐름과 기본 기능이 실제 Browser·설치 App에서 성립할 때까지 이 단계에서 개발한다.</w:t>
+        <w:t>로컬 개발 단계: 개발 PC에서 소스 수정과 정적 검사·Unit·Contract 등 기본 검증을 수행한다. 필요한 Product Process는 로컬에서 실행할 수 있으나 WSL DB는 필수 선행조건이 아니다.</w:t>
       </w:r>
     </w:p>
     <w:p>
@@ -20503,29 +20470,7 @@
         <w:spacing w:before="0" w:after="80" w:line="300" w:lineRule="auto"/>
       </w:pPr>
       <w:r>
-        <w:rPr>
-          <w:rFonts w:ascii="Malgun Gothic" w:hAnsi="Malgun Gothic" w:eastAsia="Malgun Gothic" w:cs="Malgun Gothic"/>
-          <w:color w:val="20242A"/>
-          <w:sz w:val="22"/>
-        </w:rPr>
-        <w:t xml:space="preserve">WSL 통합 단계: 승인된 GitHub 기준 Commit을 WSL에 배포하고 Client의 공개 Domain·Gateway 대상을 </w:t>
-      </w:r>
-      <w:r>
-        <w:rPr>
-          <w:rFonts w:ascii="Consolas" w:hAnsi="Consolas" w:eastAsia="Consolas" w:cs="Consolas"/>
-          <w:color w:val="1F4D78"/>
-          <w:sz w:val="21"/>
-          <w:shd w:fill="EEF2F6"/>
-        </w:rPr>
-        <w:t>WSL-server</w:t>
-      </w:r>
-      <w:r>
-        <w:rPr>
-          <w:rFonts w:ascii="Malgun Gothic" w:hAnsi="Malgun Gothic" w:eastAsia="Malgun Gothic" w:cs="Malgun Gothic"/>
-          <w:color w:val="20242A"/>
-          <w:sz w:val="22"/>
-        </w:rPr>
-        <w:t xml:space="preserve"> 환경으로 전환해 기능·Network·Process를 검증한다.</w:t>
+        <w:t>개발·통합 서버 단계: 승인 대상 Git Commit을 Push한 뒤 ssh ysna-server를 통해 /home/ubuntu/deploy/daon-user 아래의 격리 배포 단위에 반영한다. Branch 또는 Release별 Compose Project·Network·Volume과 PostgreSQL 18.4 전용 개발 DB를 사용하고 Migration 사전점검·Backup·적용·Rollback 증거를 남긴다. 기존 shared-db와 common, netdata, proxy는 사용하거나 변경하지 않는다.</w:t>
       </w:r>
     </w:p>
     <w:p>
@@ -20537,12 +20482,19 @@
         <w:spacing w:before="0" w:after="80" w:line="300" w:lineRule="auto"/>
       </w:pPr>
       <w:r>
-        <w:rPr>
-          <w:rFonts w:ascii="Malgun Gothic" w:hAnsi="Malgun Gothic" w:eastAsia="Malgun Gothic" w:cs="Malgun Gothic"/>
-          <w:color w:val="20242A"/>
-          <w:sz w:val="22"/>
-        </w:rPr>
-        <w:t>운영 단계: WSL 통합 테스트와 지정 테스트 웨이브를 통과한 뒤 승인된 GitHub 기준 Commit을 Oracle Cloud에 배포한다. 외부 운영 배포는 G9-DEPLOY 승인 기록과 Rollback·복구 절차가 있어야 한다.</w:t>
+        <w:t>통합 완료 단계: ysna-server의 지정 서버 테스트를 통과한 Commit만 PR Merge 대상으로 한다. ARM64 또는 Multi-arch 호환성을 검증하며 WSL은 선택적 격리 대체 환경일 뿐 필수 Gate가 아니다.</w:t>
+      </w:r>
+    </w:p>
+    <w:p>
+      <w:pPr>
+        <w:numPr>
+          <w:ilvl w:val="0"/>
+          <w:numId w:val="16"/>
+        </w:numPr>
+        <w:spacing w:before="0" w:after="80" w:line="300" w:lineRule="auto"/>
+      </w:pPr>
+      <w:r>
+        <w:t>운영 단계: 지정 테스트 웨이브를 통과한 승인 GitHub 기준 Commit을 Oracle Cloud에 배포한다. ysna-server 개발·통합 승인은 운영 배포 승인이 아니며 외부 운영 배포는 별도 G9-DEPLOY 승인과 Rollback·복구 절차가 있어야 한다.</w:t>
       </w:r>
     </w:p>
     <w:p>
@@ -27423,16 +27375,8 @@
             <w:vAlign w:val="center"/>
           </w:tcPr>
           <w:p>
-            <w:pPr>
-              <w:spacing w:after="0" w:line="276" w:lineRule="auto"/>
-            </w:pPr>
-            <w:r>
-              <w:rPr>
-                <w:rFonts w:ascii="Malgun Gothic" w:hAnsi="Malgun Gothic" w:eastAsia="Malgun Gothic" w:cs="Malgun Gothic"/>
-                <w:color w:val="20242A"/>
-                <w:sz w:val="17"/>
-              </w:rPr>
-              <w:t>로컬 개발→WSL 통합→Oracle Cloud 운영의 3단계 배포와 GitHub 기준선 사용</w:t>
+            <w:r>
+              <w:t>로컬 수정·검증→Git Push→ysna-server 격리 배포·전용 DB Migration·서버 테스트→PR Merge→Oracle Cloud 운영의 단계별 기준선 사용</w:t>
             </w:r>
           </w:p>
         </w:tc>
@@ -27448,16 +27392,8 @@
             <w:vAlign w:val="center"/>
           </w:tcPr>
           <w:p>
-            <w:pPr>
-              <w:spacing w:after="0" w:line="276" w:lineRule="auto"/>
-            </w:pPr>
-            <w:r>
-              <w:rPr>
-                <w:rFonts w:ascii="Malgun Gothic" w:hAnsi="Malgun Gothic" w:eastAsia="Malgun Gothic" w:cs="Malgun Gothic"/>
-                <w:color w:val="20242A"/>
-                <w:sz w:val="17"/>
-              </w:rPr>
-              <w:t>확정 · 신산님 승인 2026-07-20</w:t>
+            <w:r>
+              <w:t>확정 · 신산님 승인 2026-07-20 · APR-DEVENV-YSNA-20260720-01</w:t>
             </w:r>
           </w:p>
         </w:tc>

</xml_diff>